<commit_message>
Integration of AI (local) in the marking as a suggestion
</commit_message>
<xml_diff>
--- a/making_template/marking_template_MATH5007_A1P1_2026_S2.docx
+++ b/making_template/marking_template_MATH5007_A1P1_2026_S2.docx
@@ -457,16 +457,319 @@
         <w:rPr>
           <w:lang w:val="en-AU"/>
         </w:rPr>
-        <w:t xml:space="preserve">What course are you enrolled in? Is this unit elective or mandatory for your course? </w:t>
-      </w:r>
-      <w:r>
-        <w:rPr>
-          <w:b/>
-          <w:bCs/>
-          <w:lang w:val="en-AU"/>
-        </w:rPr>
-        <w:t>(2M)</w:t>
-      </w:r>
+        <w:t>Please mention the enrolled course and if you take the unit as a mandatory or elective one</w:t>
+      </w:r>
+      <w:r>
+        <w:rPr>
+          <w:lang w:val="en-AU"/>
+        </w:rPr>
+        <w:t xml:space="preserve"> (2M).</w:t>
+      </w:r>
+    </w:p>
+    <w:p>
+      <w:pPr>
+        <w:rPr>
+          <w:lang w:val="en-AU"/>
+        </w:rPr>
+      </w:pPr>
+    </w:p>
+    <w:p>
+      <w:pPr>
+        <w:rPr>
+          <w:lang w:val="en-AU"/>
+        </w:rPr>
+      </w:pPr>
+      <w:r>
+        <w:rPr>
+          <w:lang w:val="en-AU"/>
+        </w:rPr>
+        <w:t>[AI_RUBRIC Q1]</w:t>
+      </w:r>
+    </w:p>
+    <w:p>
+      <w:pPr>
+        <w:rPr>
+          <w:lang w:val="en-AU"/>
+        </w:rPr>
+      </w:pPr>
+      <w:proofErr w:type="spellStart"/>
+      <w:r>
+        <w:rPr>
+          <w:lang w:val="en-AU"/>
+        </w:rPr>
+        <w:t>max_score</w:t>
+      </w:r>
+      <w:proofErr w:type="spellEnd"/>
+      <w:r>
+        <w:rPr>
+          <w:lang w:val="en-AU"/>
+        </w:rPr>
+        <w:t xml:space="preserve">: </w:t>
+      </w:r>
+      <w:r>
+        <w:rPr>
+          <w:lang w:val="en-AU"/>
+        </w:rPr>
+        <w:t>2</w:t>
+      </w:r>
+    </w:p>
+    <w:p>
+      <w:pPr>
+        <w:rPr>
+          <w:lang w:val="en-AU"/>
+        </w:rPr>
+      </w:pPr>
+      <w:r>
+        <w:rPr>
+          <w:lang w:val="en-AU"/>
+        </w:rPr>
+        <w:t xml:space="preserve">focus: course enrolment; </w:t>
+      </w:r>
+      <w:r>
+        <w:rPr>
+          <w:lang w:val="en-AU"/>
+        </w:rPr>
+        <w:t>mandatory or elective; study programme</w:t>
+      </w:r>
+    </w:p>
+    <w:p>
+      <w:pPr>
+        <w:rPr>
+          <w:lang w:val="en-AU"/>
+        </w:rPr>
+      </w:pPr>
+      <w:proofErr w:type="spellStart"/>
+      <w:r>
+        <w:rPr>
+          <w:lang w:val="en-AU"/>
+        </w:rPr>
+        <w:t>minimum_requirement</w:t>
+      </w:r>
+      <w:r>
+        <w:rPr>
+          <w:lang w:val="en-AU"/>
+        </w:rPr>
+        <w:t>s</w:t>
+      </w:r>
+      <w:proofErr w:type="spellEnd"/>
+      <w:r>
+        <w:rPr>
+          <w:lang w:val="en-AU"/>
+        </w:rPr>
+        <w:t xml:space="preserve">: </w:t>
+      </w:r>
+      <w:r>
+        <w:rPr>
+          <w:lang w:val="en-AU"/>
+        </w:rPr>
+        <w:t xml:space="preserve">mentioned </w:t>
+      </w:r>
+      <w:r>
+        <w:rPr>
+          <w:lang w:val="en-AU"/>
+        </w:rPr>
+        <w:t>only one</w:t>
+      </w:r>
+      <w:r>
+        <w:rPr>
+          <w:lang w:val="en-AU"/>
+        </w:rPr>
+        <w:t xml:space="preserve"> part, </w:t>
+      </w:r>
+      <w:r>
+        <w:rPr>
+          <w:lang w:val="en-AU"/>
+        </w:rPr>
+        <w:t>either</w:t>
+      </w:r>
+      <w:r>
+        <w:rPr>
+          <w:lang w:val="en-AU"/>
+        </w:rPr>
+        <w:t xml:space="preserve"> the enrolled course </w:t>
+      </w:r>
+      <w:r>
+        <w:rPr>
+          <w:lang w:val="en-AU"/>
+        </w:rPr>
+        <w:t>or</w:t>
+      </w:r>
+      <w:r>
+        <w:rPr>
+          <w:lang w:val="en-AU"/>
+        </w:rPr>
+        <w:t xml:space="preserve"> if it is mandatory or elective. </w:t>
+      </w:r>
+    </w:p>
+    <w:p>
+      <w:pPr>
+        <w:rPr>
+          <w:lang w:val="en-AU"/>
+        </w:rPr>
+      </w:pPr>
+      <w:proofErr w:type="spellStart"/>
+      <w:r>
+        <w:rPr>
+          <w:lang w:val="en-AU"/>
+        </w:rPr>
+        <w:t>g</w:t>
+      </w:r>
+      <w:r>
+        <w:rPr>
+          <w:lang w:val="en-AU"/>
+        </w:rPr>
+        <w:t>ood_requirements</w:t>
+      </w:r>
+      <w:proofErr w:type="spellEnd"/>
+      <w:r>
+        <w:rPr>
+          <w:lang w:val="en-AU"/>
+        </w:rPr>
+        <w:t xml:space="preserve">: </w:t>
+      </w:r>
+      <w:r>
+        <w:rPr>
+          <w:lang w:val="en-AU"/>
+        </w:rPr>
+        <w:t xml:space="preserve">mentioned both parts, the enrolled course and if it is mandatory or elective. </w:t>
+      </w:r>
+    </w:p>
+    <w:p>
+      <w:pPr>
+        <w:rPr>
+          <w:lang w:val="en-AU"/>
+        </w:rPr>
+      </w:pPr>
+      <w:proofErr w:type="spellStart"/>
+      <w:r>
+        <w:rPr>
+          <w:lang w:val="en-AU"/>
+        </w:rPr>
+        <w:t>excellent_requirements</w:t>
+      </w:r>
+      <w:proofErr w:type="spellEnd"/>
+      <w:r>
+        <w:rPr>
+          <w:lang w:val="en-AU"/>
+        </w:rPr>
+        <w:t>: same as good requirements</w:t>
+      </w:r>
+    </w:p>
+    <w:p>
+      <w:pPr>
+        <w:rPr>
+          <w:lang w:val="en-AU"/>
+        </w:rPr>
+      </w:pPr>
+      <w:proofErr w:type="spellStart"/>
+      <w:r>
+        <w:rPr>
+          <w:lang w:val="en-AU"/>
+        </w:rPr>
+        <w:t>common_mistakes</w:t>
+      </w:r>
+      <w:proofErr w:type="spellEnd"/>
+      <w:r>
+        <w:rPr>
+          <w:lang w:val="en-AU"/>
+        </w:rPr>
+        <w:t>: forgetting to mention one or the other</w:t>
+      </w:r>
+    </w:p>
+    <w:p>
+      <w:pPr>
+        <w:rPr>
+          <w:lang w:val="en-AU"/>
+        </w:rPr>
+      </w:pPr>
+      <w:proofErr w:type="spellStart"/>
+      <w:r>
+        <w:rPr>
+          <w:lang w:val="en-AU"/>
+        </w:rPr>
+        <w:t>feedback_style</w:t>
+      </w:r>
+      <w:proofErr w:type="spellEnd"/>
+      <w:r>
+        <w:rPr>
+          <w:lang w:val="en-AU"/>
+        </w:rPr>
+        <w:t xml:space="preserve">: </w:t>
+      </w:r>
+      <w:r>
+        <w:rPr>
+          <w:lang w:val="en-AU"/>
+        </w:rPr>
+        <w:t>concise, academic, short</w:t>
+      </w:r>
+    </w:p>
+    <w:p>
+      <w:pPr>
+        <w:rPr>
+          <w:lang w:val="en-AU"/>
+        </w:rPr>
+      </w:pPr>
+      <w:proofErr w:type="spellStart"/>
+      <w:r>
+        <w:rPr>
+          <w:lang w:val="en-AU"/>
+        </w:rPr>
+        <w:t>model_answer_notes</w:t>
+      </w:r>
+      <w:proofErr w:type="spellEnd"/>
+      <w:r>
+        <w:rPr>
+          <w:lang w:val="en-AU"/>
+        </w:rPr>
+        <w:t>:</w:t>
+      </w:r>
+      <w:r>
+        <w:rPr>
+          <w:lang w:val="en-AU"/>
+        </w:rPr>
+        <w:t xml:space="preserve"> The course should be a </w:t>
+      </w:r>
+      <w:proofErr w:type="gramStart"/>
+      <w:r>
+        <w:rPr>
+          <w:lang w:val="en-AU"/>
+        </w:rPr>
+        <w:t>discipline</w:t>
+      </w:r>
+      <w:proofErr w:type="gramEnd"/>
+      <w:r>
+        <w:rPr>
+          <w:lang w:val="en-AU"/>
+        </w:rPr>
+        <w:t xml:space="preserve"> and it should be </w:t>
+      </w:r>
+      <w:r>
+        <w:rPr>
+          <w:lang w:val="en-AU"/>
+        </w:rPr>
+        <w:t xml:space="preserve">easy to see if this is an elective or mandatory unit. </w:t>
+      </w:r>
+    </w:p>
+    <w:p>
+      <w:pPr>
+        <w:rPr>
+          <w:lang w:val="en-AU"/>
+        </w:rPr>
+      </w:pPr>
+      <w:r>
+        <w:rPr>
+          <w:lang w:val="en-AU"/>
+        </w:rPr>
+        <w:t>[/AI_RUBRIC]</w:t>
+      </w:r>
+    </w:p>
+    <w:p>
+      <w:pPr>
+        <w:pStyle w:val="ListParagraph"/>
+        <w:rPr>
+          <w:lang w:val="en-AU"/>
+        </w:rPr>
+      </w:pPr>
     </w:p>
     <w:p>
       <w:pPr>
@@ -483,7 +786,37 @@
         <w:rPr>
           <w:lang w:val="en-AU"/>
         </w:rPr>
-        <w:t xml:space="preserve">What are you expecting to learn in this unit? </w:t>
+        <w:t xml:space="preserve">This question is about your expectations on what you learn in this unit and if it helps to secure </w:t>
+      </w:r>
+      <w:r>
+        <w:rPr>
+          <w:lang w:val="en-AU"/>
+        </w:rPr>
+        <w:t>late</w:t>
+      </w:r>
+      <w:r>
+        <w:rPr>
+          <w:lang w:val="en-AU"/>
+        </w:rPr>
+        <w:t>r</w:t>
+      </w:r>
+      <w:r>
+        <w:rPr>
+          <w:lang w:val="en-AU"/>
+        </w:rPr>
+        <w:t xml:space="preserve"> an industry</w:t>
+      </w:r>
+      <w:r>
+        <w:rPr>
+          <w:lang w:val="en-AU"/>
+        </w:rPr>
+        <w:t xml:space="preserve"> position</w:t>
+      </w:r>
+      <w:r>
+        <w:rPr>
+          <w:lang w:val="en-AU"/>
+        </w:rPr>
+        <w:t xml:space="preserve"> </w:t>
       </w:r>
       <w:r>
         <w:rPr>
@@ -508,56 +841,6 @@
           <w:lang w:val="en-AU"/>
         </w:rPr>
         <w:t>M)</w:t>
-      </w:r>
-    </w:p>
-    <w:p>
-      <w:pPr>
-        <w:pStyle w:val="ListParagraph"/>
-        <w:rPr>
-          <w:lang w:val="en-AU"/>
-        </w:rPr>
-      </w:pPr>
-      <w:r>
-        <w:rPr>
-          <w:lang w:val="en-AU"/>
-        </w:rPr>
-        <w:t xml:space="preserve">Could you imagine </w:t>
-      </w:r>
-      <w:r>
-        <w:rPr>
-          <w:lang w:val="en-AU"/>
-        </w:rPr>
-        <w:t>the</w:t>
-      </w:r>
-      <w:r>
-        <w:rPr>
-          <w:lang w:val="en-AU"/>
-        </w:rPr>
-        <w:t xml:space="preserve"> impact on your </w:t>
-      </w:r>
-      <w:r>
-        <w:rPr>
-          <w:lang w:val="en-AU"/>
-        </w:rPr>
-        <w:t>chances</w:t>
-      </w:r>
-      <w:r>
-        <w:rPr>
-          <w:lang w:val="en-AU"/>
-        </w:rPr>
-        <w:t xml:space="preserve"> </w:t>
-      </w:r>
-      <w:r>
-        <w:rPr>
-          <w:lang w:val="en-AU"/>
-        </w:rPr>
-        <w:t>of securing</w:t>
-      </w:r>
-      <w:r>
-        <w:rPr>
-          <w:lang w:val="en-AU"/>
-        </w:rPr>
-        <w:t xml:space="preserve"> an industry position? </w:t>
       </w:r>
     </w:p>
     <w:p>
@@ -581,6 +864,313 @@
         </w:rPr>
         <w:t>Note: Answers need to be justified. There is no expectation for a positive answer; instead, be honest and argue your case.</w:t>
       </w:r>
+    </w:p>
+    <w:p>
+      <w:pPr>
+        <w:rPr>
+          <w:i/>
+          <w:iCs/>
+          <w:sz w:val="16"/>
+          <w:szCs w:val="16"/>
+          <w:lang w:val="en-AU"/>
+        </w:rPr>
+      </w:pPr>
+    </w:p>
+    <w:p>
+      <w:pPr>
+        <w:rPr>
+          <w:lang w:val="en-AU"/>
+        </w:rPr>
+      </w:pPr>
+      <w:r>
+        <w:rPr>
+          <w:lang w:val="en-AU"/>
+        </w:rPr>
+        <w:t>[AI_RUBRIC Q</w:t>
+      </w:r>
+      <w:r>
+        <w:rPr>
+          <w:lang w:val="en-AU"/>
+        </w:rPr>
+        <w:t>2</w:t>
+      </w:r>
+      <w:r>
+        <w:rPr>
+          <w:lang w:val="en-AU"/>
+        </w:rPr>
+        <w:t>]</w:t>
+      </w:r>
+    </w:p>
+    <w:p>
+      <w:pPr>
+        <w:rPr>
+          <w:lang w:val="en-AU"/>
+        </w:rPr>
+      </w:pPr>
+      <w:proofErr w:type="spellStart"/>
+      <w:r>
+        <w:rPr>
+          <w:lang w:val="en-AU"/>
+        </w:rPr>
+        <w:t>max_score</w:t>
+      </w:r>
+      <w:proofErr w:type="spellEnd"/>
+      <w:r>
+        <w:rPr>
+          <w:lang w:val="en-AU"/>
+        </w:rPr>
+        <w:t>: 5</w:t>
+      </w:r>
+    </w:p>
+    <w:p>
+      <w:pPr>
+        <w:rPr>
+          <w:lang w:val="en-AU"/>
+        </w:rPr>
+      </w:pPr>
+      <w:r>
+        <w:rPr>
+          <w:lang w:val="en-AU"/>
+        </w:rPr>
+        <w:t xml:space="preserve">focus: </w:t>
+      </w:r>
+      <w:r>
+        <w:rPr>
+          <w:lang w:val="en-AU"/>
+        </w:rPr>
+        <w:t>learning goals, expectations in the unit, expectation for future work</w:t>
+      </w:r>
+    </w:p>
+    <w:p>
+      <w:pPr>
+        <w:rPr>
+          <w:lang w:val="en-AU"/>
+        </w:rPr>
+      </w:pPr>
+      <w:proofErr w:type="spellStart"/>
+      <w:r>
+        <w:rPr>
+          <w:lang w:val="en-AU"/>
+        </w:rPr>
+        <w:t>minimum_requirements</w:t>
+      </w:r>
+      <w:proofErr w:type="spellEnd"/>
+      <w:r>
+        <w:rPr>
+          <w:lang w:val="en-AU"/>
+        </w:rPr>
+        <w:t xml:space="preserve">: </w:t>
+      </w:r>
+      <w:r>
+        <w:rPr>
+          <w:lang w:val="en-AU"/>
+        </w:rPr>
+        <w:t>Provided an answer</w:t>
+      </w:r>
+      <w:r>
+        <w:rPr>
+          <w:lang w:val="en-AU"/>
+        </w:rPr>
+        <w:t xml:space="preserve"> but without arguments or justifications</w:t>
+      </w:r>
+    </w:p>
+    <w:p>
+      <w:pPr>
+        <w:rPr>
+          <w:lang w:val="en-AU"/>
+        </w:rPr>
+      </w:pPr>
+      <w:proofErr w:type="spellStart"/>
+      <w:r>
+        <w:rPr>
+          <w:lang w:val="en-AU"/>
+        </w:rPr>
+        <w:t>good_requirements</w:t>
+      </w:r>
+      <w:proofErr w:type="spellEnd"/>
+      <w:r>
+        <w:rPr>
+          <w:lang w:val="en-AU"/>
+        </w:rPr>
+        <w:t xml:space="preserve">: </w:t>
+      </w:r>
+      <w:r>
+        <w:rPr>
+          <w:lang w:val="en-AU"/>
+        </w:rPr>
+        <w:t xml:space="preserve">Provided an answer and a minimal arguments or justification. </w:t>
+      </w:r>
+    </w:p>
+    <w:p>
+      <w:pPr>
+        <w:rPr>
+          <w:lang w:val="en-AU"/>
+        </w:rPr>
+      </w:pPr>
+      <w:proofErr w:type="spellStart"/>
+      <w:r>
+        <w:rPr>
+          <w:lang w:val="en-AU"/>
+        </w:rPr>
+        <w:lastRenderedPageBreak/>
+        <w:t>excellent_requirements</w:t>
+      </w:r>
+      <w:proofErr w:type="spellEnd"/>
+      <w:r>
+        <w:rPr>
+          <w:lang w:val="en-AU"/>
+        </w:rPr>
+        <w:t xml:space="preserve">: </w:t>
+      </w:r>
+      <w:r>
+        <w:rPr>
+          <w:lang w:val="en-AU"/>
+        </w:rPr>
+        <w:t xml:space="preserve">Clear explanation </w:t>
+      </w:r>
+      <w:r>
+        <w:rPr>
+          <w:lang w:val="en-AU"/>
+        </w:rPr>
+        <w:t xml:space="preserve">of the expectations, </w:t>
+      </w:r>
+      <w:r>
+        <w:rPr>
+          <w:lang w:val="en-AU"/>
+        </w:rPr>
+        <w:t xml:space="preserve">either negative or positive. It is constructive and provides insight </w:t>
+      </w:r>
+      <w:r>
+        <w:rPr>
+          <w:lang w:val="en-AU"/>
+        </w:rPr>
+        <w:t>on the students reasoning.</w:t>
+      </w:r>
+      <w:r>
+        <w:rPr>
+          <w:lang w:val="en-AU"/>
+        </w:rPr>
+        <w:t xml:space="preserve"> </w:t>
+      </w:r>
+    </w:p>
+    <w:p>
+      <w:pPr>
+        <w:rPr>
+          <w:lang w:val="en-AU"/>
+        </w:rPr>
+      </w:pPr>
+      <w:proofErr w:type="spellStart"/>
+      <w:r>
+        <w:rPr>
+          <w:lang w:val="en-AU"/>
+        </w:rPr>
+        <w:t>common_mistakes</w:t>
+      </w:r>
+      <w:proofErr w:type="spellEnd"/>
+      <w:r>
+        <w:rPr>
+          <w:lang w:val="en-AU"/>
+        </w:rPr>
+        <w:t xml:space="preserve">: </w:t>
+      </w:r>
+      <w:r>
+        <w:rPr>
+          <w:lang w:val="en-AU"/>
+        </w:rPr>
+        <w:t>Answer does not include arguments or reasoning.</w:t>
+      </w:r>
+    </w:p>
+    <w:p>
+      <w:pPr>
+        <w:rPr>
+          <w:lang w:val="en-AU"/>
+        </w:rPr>
+      </w:pPr>
+      <w:proofErr w:type="spellStart"/>
+      <w:r>
+        <w:rPr>
+          <w:lang w:val="en-AU"/>
+        </w:rPr>
+        <w:t>feedback_style</w:t>
+      </w:r>
+      <w:proofErr w:type="spellEnd"/>
+      <w:r>
+        <w:rPr>
+          <w:lang w:val="en-AU"/>
+        </w:rPr>
+        <w:t xml:space="preserve">: </w:t>
+      </w:r>
+      <w:r>
+        <w:rPr>
+          <w:lang w:val="en-AU"/>
+        </w:rPr>
+        <w:t>concise, academic, constructive</w:t>
+      </w:r>
+    </w:p>
+    <w:p>
+      <w:pPr>
+        <w:rPr>
+          <w:lang w:val="en-AU"/>
+        </w:rPr>
+      </w:pPr>
+      <w:proofErr w:type="spellStart"/>
+      <w:r>
+        <w:rPr>
+          <w:lang w:val="en-AU"/>
+        </w:rPr>
+        <w:t>model_answer_notes</w:t>
+      </w:r>
+      <w:proofErr w:type="spellEnd"/>
+      <w:r>
+        <w:rPr>
+          <w:lang w:val="en-AU"/>
+        </w:rPr>
+        <w:t xml:space="preserve">: </w:t>
+      </w:r>
+      <w:r>
+        <w:rPr>
+          <w:lang w:val="en-AU"/>
+        </w:rPr>
+        <w:t>Future industry position could imply staying at the university. The argument is important, not the answer itself.</w:t>
+      </w:r>
+      <w:r>
+        <w:rPr>
+          <w:lang w:val="en-AU"/>
+        </w:rPr>
+        <w:t xml:space="preserve"> Students can have a negative expectation or no outlook in a later position. </w:t>
+      </w:r>
+    </w:p>
+    <w:p>
+      <w:pPr>
+        <w:rPr>
+          <w:lang w:val="en-AU"/>
+        </w:rPr>
+      </w:pPr>
+      <w:r>
+        <w:rPr>
+          <w:lang w:val="en-AU"/>
+        </w:rPr>
+        <w:t>[/AI_RUBRIC]</w:t>
+      </w:r>
+    </w:p>
+    <w:p>
+      <w:pPr>
+        <w:rPr>
+          <w:lang w:val="en-AU"/>
+        </w:rPr>
+      </w:pPr>
+    </w:p>
+    <w:p>
+      <w:pPr>
+        <w:pStyle w:val="ListParagraph"/>
+        <w:rPr>
+          <w:i/>
+          <w:iCs/>
+          <w:sz w:val="16"/>
+          <w:szCs w:val="16"/>
+          <w:lang w:val="en-AU"/>
+        </w:rPr>
+      </w:pPr>
     </w:p>
     <w:p>
       <w:pPr>
@@ -1146,7 +1736,6 @@
         </w:numPr>
       </w:pPr>
       <w:r>
-        <w:lastRenderedPageBreak/>
         <w:t>Add an overall</w:t>
       </w:r>
       <w:r>

</xml_diff>